<commit_message>
chore: clean up repo structure for academic submission - add .gitignore, .env.example files, update README with live deployment URLs and remove 3D Paint Service
</commit_message>
<xml_diff>
--- a/AutoCare_Chapter5_Implementation.docx
+++ b/AutoCare_Chapter5_Implementation.docx
@@ -2940,7 +2940,7 @@
                 <w:b/>
                 <w:bCs/>
               </w:rPr>
-              <w:t xml:space="preserve">Backend</w:t>
+              <w:t xml:space="preserve">Frontend</w:t>
             </w:r>
           </w:p>
         </w:tc>
@@ -2967,9 +2967,14 @@
               <w:pStyle w:val="MdTableCell"/>
               <w:jc w:val="left"/>
             </w:pPr>
-            <w:r>
-              <w:t xml:space="preserve">Hosted Node.js/Express API</w:t>
-            </w:r>
+            <w:hyperlink w:history="1" r:id="rIde6hkeqvol_-f1grc-gd41">
+              <w:r>
+                <w:rPr>
+                  <w:rStyle w:val="MdLink"/>
+                </w:rPr>
+                <w:t xml:space="preserve">https://frontend-phi-rouge-27.vercel.app</w:t>
+              </w:r>
+            </w:hyperlink>
           </w:p>
         </w:tc>
       </w:tr>
@@ -2992,7 +2997,7 @@
                 <w:b/>
                 <w:bCs/>
               </w:rPr>
-              <w:t xml:space="preserve">Frontend</w:t>
+              <w:t xml:space="preserve">Backend API</w:t>
             </w:r>
           </w:p>
         </w:tc>
@@ -3019,12 +3024,69 @@
               <w:pStyle w:val="MdTableCell"/>
               <w:jc w:val="left"/>
             </w:pPr>
-            <w:hyperlink w:history="1" r:id="rIdkqumj4uqlxicvxxgt_4fp">
+            <w:hyperlink w:history="1" r:id="rId6yhstq3k0v_n-sazpimxu">
               <w:r>
                 <w:rPr>
                   <w:rStyle w:val="MdLink"/>
                 </w:rPr>
-                <w:t xml:space="preserve">https://auto-care-frontend.vercel.app</w:t>
+                <w:t xml:space="preserve">https://backend-phi-sand-87.vercel.app</w:t>
+              </w:r>
+            </w:hyperlink>
+          </w:p>
+        </w:tc>
+      </w:tr>
+      <w:tr>
+        <w:trPr>
+          <w:cantSplit/>
+        </w:trPr>
+        <w:tc>
+          <w:tcPr>
+            <w:vAlign w:val="center"/>
+          </w:tcPr>
+          <w:p>
+            <w:pPr>
+              <w:pStyle w:val="MdTableCell"/>
+              <w:jc w:val="left"/>
+            </w:pPr>
+            <w:r>
+              <w:rPr>
+                <w:rStyle w:val="MdStrong"/>
+                <w:b/>
+                <w:bCs/>
+              </w:rPr>
+              <w:t xml:space="preserve">Socket Server</w:t>
+            </w:r>
+          </w:p>
+        </w:tc>
+        <w:tc>
+          <w:tcPr>
+            <w:vAlign w:val="center"/>
+          </w:tcPr>
+          <w:p>
+            <w:pPr>
+              <w:pStyle w:val="MdTableCell"/>
+              <w:jc w:val="left"/>
+            </w:pPr>
+            <w:r>
+              <w:t xml:space="preserve">Vercel</w:t>
+            </w:r>
+          </w:p>
+        </w:tc>
+        <w:tc>
+          <w:tcPr>
+            <w:vAlign w:val="center"/>
+          </w:tcPr>
+          <w:p>
+            <w:pPr>
+              <w:pStyle w:val="MdTableCell"/>
+              <w:jc w:val="left"/>
+            </w:pPr>
+            <w:hyperlink w:history="1" r:id="rId78qxtncsfbolxzputft9f">
+              <w:r>
+                <w:rPr>
+                  <w:rStyle w:val="MdLink"/>
+                </w:rPr>
+                <w:t xml:space="preserve">https://socket-flax.vercel.app</w:t>
               </w:r>
             </w:hyperlink>
           </w:p>
@@ -3077,7 +3139,14 @@
               <w:jc w:val="left"/>
             </w:pPr>
             <w:r>
-              <w:t xml:space="preserve">Cloud clustered NoSQL database</w:t>
+              <w:rPr>
+                <w:rStyle w:val="MdCode"/>
+                <w:u w:val="single"/>
+              </w:rPr>
+              <w:t xml:space="preserve">auto-care.focfxin.mongodb.net</w:t>
+            </w:r>
+            <w:r>
+              <w:t xml:space="preserve"> (Cloud clustered NoSQL)</w:t>
             </w:r>
           </w:p>
         </w:tc>
@@ -5611,7 +5680,137 @@
         <w:pStyle w:val="MdParagraph"/>
       </w:pPr>
       <w:r>
-        <w:t xml:space="preserve">In future iterations, we aim to enhance the platform's scalability by expanding the AI capabilities, replacing the heuristic-based oil recommender with an ML model trained on massive automotive datasets for superior accuracy. Additionally, we plan to integrate a logistics tracking API to provide automated live shipping updates. Additional localized payment gateways will also be added to serve a broader geographic market, alongside mobile application versions deployed to iOS and Android platforms via React Native.</w:t>
+        <w:t xml:space="preserve">In future iterations, the following enhancements are planned for the AutoCare platform:</w:t>
+      </w:r>
+    </w:p>
+    <w:p>
+      <w:pPr>
+        <w:pStyle w:val="MdSpace"/>
+      </w:pPr>
+    </w:p>
+    <w:p>
+      <w:pPr>
+        <w:pStyle w:val="ListParagraph"/>
+        <w:pStyle w:val="MdListItem"/>
+        <w:numPr>
+          <w:ilvl w:val="0"/>
+          <w:numId w:val="1"/>
+        </w:numPr>
+      </w:pPr>
+      <w:r>
+        <w:rPr>
+          <w:rStyle w:val="MdStrong"/>
+          <w:b/>
+          <w:bCs/>
+        </w:rPr>
+        <w:t xml:space="preserve">Interactive 3D Paint Service:</w:t>
+      </w:r>
+      <w:r>
+        <w:t xml:space="preserve"> A fully immersive customization tool allowing customers to explore compatible 3D car models (</w:t>
+      </w:r>
+      <w:r>
+        <w:rPr>
+          <w:rStyle w:val="MdCode"/>
+          <w:u w:val="single"/>
+        </w:rPr>
+        <w:t xml:space="preserve">.glb</w:t>
+      </w:r>
+      <w:r>
+        <w:t xml:space="preserve">/</w:t>
+      </w:r>
+      <w:r>
+        <w:rPr>
+          <w:rStyle w:val="MdCode"/>
+          <w:u w:val="single"/>
+        </w:rPr>
+        <w:t xml:space="preserve">.gltf</w:t>
+      </w:r>
+      <w:r>
+        <w:t xml:space="preserve">) and select from a wide range of premium paint colors and finish specs in real-time. Sellers will be able to upload their own 3D car models and offer paint job services with auto-calculated pricing and a direct cart-checkout integration.</w:t>
+      </w:r>
+    </w:p>
+    <w:p>
+      <w:pPr>
+        <w:pStyle w:val="ListParagraph"/>
+        <w:pStyle w:val="MdListItem"/>
+        <w:numPr>
+          <w:ilvl w:val="0"/>
+          <w:numId w:val="1"/>
+        </w:numPr>
+      </w:pPr>
+      <w:r>
+        <w:rPr>
+          <w:rStyle w:val="MdStrong"/>
+          <w:b/>
+          <w:bCs/>
+        </w:rPr>
+        <w:t xml:space="preserve">AI-Based Oil Recommendation Engine:</w:t>
+      </w:r>
+      <w:r>
+        <w:t xml:space="preserve"> Replace the current heuristic-based oil recommender with a Machine Learning model trained on large automotive datasets for superior accuracy and personalization.</w:t>
+      </w:r>
+    </w:p>
+    <w:p>
+      <w:pPr>
+        <w:pStyle w:val="ListParagraph"/>
+        <w:pStyle w:val="MdListItem"/>
+        <w:numPr>
+          <w:ilvl w:val="0"/>
+          <w:numId w:val="1"/>
+        </w:numPr>
+      </w:pPr>
+      <w:r>
+        <w:rPr>
+          <w:rStyle w:val="MdStrong"/>
+          <w:b/>
+          <w:bCs/>
+        </w:rPr>
+        <w:t xml:space="preserve">Live Logistics Tracking:</w:t>
+      </w:r>
+      <w:r>
+        <w:t xml:space="preserve"> Integration with a third-party logistics API to provide automated, real-time shipment tracking updates to buyers.</w:t>
+      </w:r>
+    </w:p>
+    <w:p>
+      <w:pPr>
+        <w:pStyle w:val="ListParagraph"/>
+        <w:pStyle w:val="MdListItem"/>
+        <w:numPr>
+          <w:ilvl w:val="0"/>
+          <w:numId w:val="1"/>
+        </w:numPr>
+      </w:pPr>
+      <w:r>
+        <w:rPr>
+          <w:rStyle w:val="MdStrong"/>
+          <w:b/>
+          <w:bCs/>
+        </w:rPr>
+        <w:t xml:space="preserve">Additional Payment Gateways:</w:t>
+      </w:r>
+      <w:r>
+        <w:t xml:space="preserve"> Support for localized payment methods (JazzCash, EasyPaisa, etc.) to serve a broader geographic market.</w:t>
+      </w:r>
+    </w:p>
+    <w:p>
+      <w:pPr>
+        <w:pStyle w:val="ListParagraph"/>
+        <w:pStyle w:val="MdListItem"/>
+        <w:numPr>
+          <w:ilvl w:val="0"/>
+          <w:numId w:val="1"/>
+        </w:numPr>
+      </w:pPr>
+      <w:r>
+        <w:rPr>
+          <w:rStyle w:val="MdStrong"/>
+          <w:b/>
+          <w:bCs/>
+        </w:rPr>
+        <w:t xml:space="preserve">Mobile Application:</w:t>
+      </w:r>
+      <w:r>
+        <w:t xml:space="preserve"> Native iOS and Android apps built with React Native for a fully mobile-first experience.</w:t>
       </w:r>
     </w:p>
     <w:p>
@@ -5643,6 +5842,27 @@
           <w:b/>
           <w:bCs/>
         </w:rPr>
+        <w:t xml:space="preserve">3D Paint Service Deferred:</w:t>
+      </w:r>
+      <w:r>
+        <w:t xml:space="preserve"> The Interactive 3D Paint Service feature has been scoped as a future enhancement due to the complexity of building a real-time 3D rendering engine within the project timeline. The backend model schema and upload infrastructure are already in place.</w:t>
+      </w:r>
+    </w:p>
+    <w:p>
+      <w:pPr>
+        <w:pStyle w:val="ListParagraph"/>
+        <w:pStyle w:val="MdListItem"/>
+        <w:numPr>
+          <w:ilvl w:val="0"/>
+          <w:numId w:val="1"/>
+        </w:numPr>
+      </w:pPr>
+      <w:r>
+        <w:rPr>
+          <w:rStyle w:val="MdStrong"/>
+          <w:b/>
+          <w:bCs/>
+        </w:rPr>
         <w:t xml:space="preserve">Data Limitations:</w:t>
       </w:r>
       <w:r>
@@ -5695,7 +5915,7 @@
       <w:r>
         <w:t xml:space="preserve">Node.js Documentation. [Online]. Available: </w:t>
       </w:r>
-      <w:hyperlink w:history="1" r:id="rIdzemrbwc6a_ewexl3g9mrr">
+      <w:hyperlink w:history="1" r:id="rIdokukxaoawomiyfheloayt">
         <w:r>
           <w:rPr>
             <w:rStyle w:val="MdLink"/>
@@ -5715,7 +5935,7 @@
       <w:r>
         <w:t xml:space="preserve">React.js Official Guide. [Online]. Available: </w:t>
       </w:r>
-      <w:hyperlink w:history="1" r:id="rIdgnt4qftk6qquaigp7vv9d">
+      <w:hyperlink w:history="1" r:id="rIdni0a7-goar8riw-uqoewo">
         <w:r>
           <w:rPr>
             <w:rStyle w:val="MdLink"/>
@@ -5735,7 +5955,7 @@
       <w:r>
         <w:t xml:space="preserve">Stripe API Reference. [Online]. Available: </w:t>
       </w:r>
-      <w:hyperlink w:history="1" r:id="rIdailr9f8cshiphetanhs4n">
+      <w:hyperlink w:history="1" r:id="rIdwye0zuycvpqtiqboyzypl">
         <w:r>
           <w:rPr>
             <w:rStyle w:val="MdLink"/>
@@ -5755,7 +5975,7 @@
       <w:r>
         <w:t xml:space="preserve">Socket.io Documentation. [Online]. Available: </w:t>
       </w:r>
-      <w:hyperlink w:history="1" r:id="rIdpua7gmmpnstzdiuajdlbh">
+      <w:hyperlink w:history="1" r:id="rIdupvc_o4_munsdgzitftxa">
         <w:r>
           <w:rPr>
             <w:rStyle w:val="MdLink"/>

</xml_diff>